<commit_message>
Update project report and improve report generation scripts
</commit_message>
<xml_diff>
--- a/docs/Project_Report.docx
+++ b/docs/Project_Report.docx
@@ -122,6 +122,7 @@
     </w:p>
     <w:tbl>
       <w:tblPr>
+        <w:tblLayout w:type="fixed"/>
         <w:tblW w:w="10440" w:type="dxa"/>
         <w:tblBorders>
           <w:top w:val="single" w:sz="4" w:color="A0A0A0"/>
@@ -140,9 +141,18 @@
         <w:gridCol w:w="2088"/>
       </w:tblGrid>
       <w:tr>
+        <w:trPr>
+          <w:tblHeader w:val="true"/>
+        </w:trPr>
         <w:tc>
           <w:tcPr>
             <w:tcW w:w="2088" w:type="dxa"/>
+            <w:tcMar>
+              <w:top w:w="55" w:type="dxa"/>
+              <w:start w:w="55" w:type="dxa"/>
+              <w:bottom w:w="55" w:type="dxa"/>
+              <w:end w:w="55" w:type="dxa"/>
+            </w:tcMar>
             <w:shd w:fill="D9EAF7"/>
           </w:tcPr>
           <w:p>
@@ -157,6 +167,12 @@
         <w:tc>
           <w:tcPr>
             <w:tcW w:w="2088" w:type="dxa"/>
+            <w:tcMar>
+              <w:top w:w="55" w:type="dxa"/>
+              <w:start w:w="55" w:type="dxa"/>
+              <w:bottom w:w="55" w:type="dxa"/>
+              <w:end w:w="55" w:type="dxa"/>
+            </w:tcMar>
             <w:shd w:fill="D9EAF7"/>
           </w:tcPr>
           <w:p>
@@ -171,6 +187,12 @@
         <w:tc>
           <w:tcPr>
             <w:tcW w:w="2088" w:type="dxa"/>
+            <w:tcMar>
+              <w:top w:w="55" w:type="dxa"/>
+              <w:start w:w="55" w:type="dxa"/>
+              <w:bottom w:w="55" w:type="dxa"/>
+              <w:end w:w="55" w:type="dxa"/>
+            </w:tcMar>
             <w:shd w:fill="D9EAF7"/>
           </w:tcPr>
           <w:p>
@@ -185,6 +207,12 @@
         <w:tc>
           <w:tcPr>
             <w:tcW w:w="2088" w:type="dxa"/>
+            <w:tcMar>
+              <w:top w:w="55" w:type="dxa"/>
+              <w:start w:w="55" w:type="dxa"/>
+              <w:bottom w:w="55" w:type="dxa"/>
+              <w:end w:w="55" w:type="dxa"/>
+            </w:tcMar>
             <w:shd w:fill="D9EAF7"/>
           </w:tcPr>
           <w:p>
@@ -199,6 +227,12 @@
         <w:tc>
           <w:tcPr>
             <w:tcW w:w="2088" w:type="dxa"/>
+            <w:tcMar>
+              <w:top w:w="55" w:type="dxa"/>
+              <w:start w:w="55" w:type="dxa"/>
+              <w:bottom w:w="55" w:type="dxa"/>
+              <w:end w:w="55" w:type="dxa"/>
+            </w:tcMar>
             <w:shd w:fill="D9EAF7"/>
           </w:tcPr>
           <w:p>
@@ -212,9 +246,18 @@
         </w:tc>
       </w:tr>
       <w:tr>
+        <w:trPr>
+          <w:cantSplit/>
+        </w:trPr>
         <w:tc>
           <w:tcPr>
             <w:tcW w:w="2088" w:type="dxa"/>
+            <w:tcMar>
+              <w:top w:w="55" w:type="dxa"/>
+              <w:start w:w="55" w:type="dxa"/>
+              <w:bottom w:w="55" w:type="dxa"/>
+              <w:end w:w="55" w:type="dxa"/>
+            </w:tcMar>
           </w:tcPr>
           <w:p>
             <w:r>
@@ -225,6 +268,12 @@
         <w:tc>
           <w:tcPr>
             <w:tcW w:w="2088" w:type="dxa"/>
+            <w:tcMar>
+              <w:top w:w="55" w:type="dxa"/>
+              <w:start w:w="55" w:type="dxa"/>
+              <w:bottom w:w="55" w:type="dxa"/>
+              <w:end w:w="55" w:type="dxa"/>
+            </w:tcMar>
           </w:tcPr>
           <w:p>
             <w:r>
@@ -235,6 +284,12 @@
         <w:tc>
           <w:tcPr>
             <w:tcW w:w="2088" w:type="dxa"/>
+            <w:tcMar>
+              <w:top w:w="55" w:type="dxa"/>
+              <w:start w:w="55" w:type="dxa"/>
+              <w:bottom w:w="55" w:type="dxa"/>
+              <w:end w:w="55" w:type="dxa"/>
+            </w:tcMar>
           </w:tcPr>
           <w:p>
             <w:r>
@@ -245,6 +300,12 @@
         <w:tc>
           <w:tcPr>
             <w:tcW w:w="2088" w:type="dxa"/>
+            <w:tcMar>
+              <w:top w:w="55" w:type="dxa"/>
+              <w:start w:w="55" w:type="dxa"/>
+              <w:bottom w:w="55" w:type="dxa"/>
+              <w:end w:w="55" w:type="dxa"/>
+            </w:tcMar>
           </w:tcPr>
           <w:p>
             <w:r>
@@ -255,18 +316,33 @@
         <w:tc>
           <w:tcPr>
             <w:tcW w:w="2088" w:type="dxa"/>
-          </w:tcPr>
-          <w:p>
-            <w:r>
-              <w:t xml:space="preserve">60.71%</w:t>
+            <w:tcMar>
+              <w:top w:w="55" w:type="dxa"/>
+              <w:start w:w="55" w:type="dxa"/>
+              <w:bottom w:w="55" w:type="dxa"/>
+              <w:end w:w="55" w:type="dxa"/>
+            </w:tcMar>
+          </w:tcPr>
+          <w:p>
+            <w:r>
+              <w:t xml:space="preserve">60.7%</w:t>
             </w:r>
           </w:p>
         </w:tc>
       </w:tr>
       <w:tr>
+        <w:trPr>
+          <w:cantSplit/>
+        </w:trPr>
         <w:tc>
           <w:tcPr>
             <w:tcW w:w="2088" w:type="dxa"/>
+            <w:tcMar>
+              <w:top w:w="55" w:type="dxa"/>
+              <w:start w:w="55" w:type="dxa"/>
+              <w:bottom w:w="55" w:type="dxa"/>
+              <w:end w:w="55" w:type="dxa"/>
+            </w:tcMar>
           </w:tcPr>
           <w:p>
             <w:r>
@@ -277,6 +353,12 @@
         <w:tc>
           <w:tcPr>
             <w:tcW w:w="2088" w:type="dxa"/>
+            <w:tcMar>
+              <w:top w:w="55" w:type="dxa"/>
+              <w:start w:w="55" w:type="dxa"/>
+              <w:bottom w:w="55" w:type="dxa"/>
+              <w:end w:w="55" w:type="dxa"/>
+            </w:tcMar>
           </w:tcPr>
           <w:p>
             <w:r>
@@ -287,6 +369,12 @@
         <w:tc>
           <w:tcPr>
             <w:tcW w:w="2088" w:type="dxa"/>
+            <w:tcMar>
+              <w:top w:w="55" w:type="dxa"/>
+              <w:start w:w="55" w:type="dxa"/>
+              <w:bottom w:w="55" w:type="dxa"/>
+              <w:end w:w="55" w:type="dxa"/>
+            </w:tcMar>
           </w:tcPr>
           <w:p>
             <w:r>
@@ -297,6 +385,12 @@
         <w:tc>
           <w:tcPr>
             <w:tcW w:w="2088" w:type="dxa"/>
+            <w:tcMar>
+              <w:top w:w="55" w:type="dxa"/>
+              <w:start w:w="55" w:type="dxa"/>
+              <w:bottom w:w="55" w:type="dxa"/>
+              <w:end w:w="55" w:type="dxa"/>
+            </w:tcMar>
           </w:tcPr>
           <w:p>
             <w:r>
@@ -307,18 +401,33 @@
         <w:tc>
           <w:tcPr>
             <w:tcW w:w="2088" w:type="dxa"/>
-          </w:tcPr>
-          <w:p>
-            <w:r>
-              <w:t xml:space="preserve">60.80%</w:t>
+            <w:tcMar>
+              <w:top w:w="55" w:type="dxa"/>
+              <w:start w:w="55" w:type="dxa"/>
+              <w:bottom w:w="55" w:type="dxa"/>
+              <w:end w:w="55" w:type="dxa"/>
+            </w:tcMar>
+          </w:tcPr>
+          <w:p>
+            <w:r>
+              <w:t xml:space="preserve">60.8%</w:t>
             </w:r>
           </w:p>
         </w:tc>
       </w:tr>
       <w:tr>
+        <w:trPr>
+          <w:cantSplit/>
+        </w:trPr>
         <w:tc>
           <w:tcPr>
             <w:tcW w:w="2088" w:type="dxa"/>
+            <w:tcMar>
+              <w:top w:w="55" w:type="dxa"/>
+              <w:start w:w="55" w:type="dxa"/>
+              <w:bottom w:w="55" w:type="dxa"/>
+              <w:end w:w="55" w:type="dxa"/>
+            </w:tcMar>
           </w:tcPr>
           <w:p>
             <w:r>
@@ -329,6 +438,12 @@
         <w:tc>
           <w:tcPr>
             <w:tcW w:w="2088" w:type="dxa"/>
+            <w:tcMar>
+              <w:top w:w="55" w:type="dxa"/>
+              <w:start w:w="55" w:type="dxa"/>
+              <w:bottom w:w="55" w:type="dxa"/>
+              <w:end w:w="55" w:type="dxa"/>
+            </w:tcMar>
           </w:tcPr>
           <w:p>
             <w:r>
@@ -339,6 +454,12 @@
         <w:tc>
           <w:tcPr>
             <w:tcW w:w="2088" w:type="dxa"/>
+            <w:tcMar>
+              <w:top w:w="55" w:type="dxa"/>
+              <w:start w:w="55" w:type="dxa"/>
+              <w:bottom w:w="55" w:type="dxa"/>
+              <w:end w:w="55" w:type="dxa"/>
+            </w:tcMar>
           </w:tcPr>
           <w:p>
             <w:r>
@@ -349,6 +470,12 @@
         <w:tc>
           <w:tcPr>
             <w:tcW w:w="2088" w:type="dxa"/>
+            <w:tcMar>
+              <w:top w:w="55" w:type="dxa"/>
+              <w:start w:w="55" w:type="dxa"/>
+              <w:bottom w:w="55" w:type="dxa"/>
+              <w:end w:w="55" w:type="dxa"/>
+            </w:tcMar>
           </w:tcPr>
           <w:p>
             <w:r>
@@ -359,10 +486,16 @@
         <w:tc>
           <w:tcPr>
             <w:tcW w:w="2088" w:type="dxa"/>
-          </w:tcPr>
-          <w:p>
-            <w:r>
-              <w:t xml:space="preserve">60.44%</w:t>
+            <w:tcMar>
+              <w:top w:w="55" w:type="dxa"/>
+              <w:start w:w="55" w:type="dxa"/>
+              <w:bottom w:w="55" w:type="dxa"/>
+              <w:end w:w="55" w:type="dxa"/>
+            </w:tcMar>
+          </w:tcPr>
+          <w:p>
+            <w:r>
+              <w:t xml:space="preserve">60.4%</w:t>
             </w:r>
           </w:p>
         </w:tc>
@@ -507,11 +640,12 @@
     <w:p>
       <w:pPr/>
       <w:r>
-        <w:t xml:space="preserve">The validation-selected alpha values are 0.63 for TF-IDF plus ResNet and 0.38 for DistilBERT plus ResNet. Test metrics on the 150-image aligned subset are:</w:t>
+        <w:t xml:space="preserve">The validation-selected alpha values are 0.63 for TF-IDF plus ResNet and 0.38 for DistilBERT plus ResNet. The held-out fusion evaluation uses exactly 150 aligned test examples (91 Fake, 59 True), selected by the existing image manifest from the official 59,163-row test split. The remaining 59,013 official test examples are not included. Test metrics on this subset are:</w:t>
       </w:r>
     </w:p>
     <w:tbl>
       <w:tblPr>
+        <w:tblLayout w:type="fixed"/>
         <w:tblW w:w="10440" w:type="dxa"/>
         <w:tblBorders>
           <w:top w:val="single" w:sz="4" w:color="A0A0A0"/>
@@ -523,18 +657,26 @@
         </w:tblBorders>
       </w:tblPr>
       <w:tblGrid>
-        <w:gridCol w:w="1491"/>
-        <w:gridCol w:w="1491"/>
-        <w:gridCol w:w="1491"/>
-        <w:gridCol w:w="1491"/>
-        <w:gridCol w:w="1491"/>
-        <w:gridCol w:w="1491"/>
-        <w:gridCol w:w="1491"/>
+        <w:gridCol w:w="1740"/>
+        <w:gridCol w:w="1740"/>
+        <w:gridCol w:w="1740"/>
+        <w:gridCol w:w="1740"/>
+        <w:gridCol w:w="1740"/>
+        <w:gridCol w:w="1740"/>
       </w:tblGrid>
       <w:tr>
-        <w:tc>
-          <w:tcPr>
-            <w:tcW w:w="1491" w:type="dxa"/>
+        <w:trPr>
+          <w:tblHeader w:val="true"/>
+        </w:trPr>
+        <w:tc>
+          <w:tcPr>
+            <w:tcW w:w="1740" w:type="dxa"/>
+            <w:tcMar>
+              <w:top w:w="55" w:type="dxa"/>
+              <w:start w:w="55" w:type="dxa"/>
+              <w:bottom w:w="55" w:type="dxa"/>
+              <w:end w:w="55" w:type="dxa"/>
+            </w:tcMar>
             <w:shd w:fill="D9EAF7"/>
           </w:tcPr>
           <w:p>
@@ -548,7 +690,13 @@
         </w:tc>
         <w:tc>
           <w:tcPr>
-            <w:tcW w:w="1491" w:type="dxa"/>
+            <w:tcW w:w="1740" w:type="dxa"/>
+            <w:tcMar>
+              <w:top w:w="55" w:type="dxa"/>
+              <w:start w:w="55" w:type="dxa"/>
+              <w:bottom w:w="55" w:type="dxa"/>
+              <w:end w:w="55" w:type="dxa"/>
+            </w:tcMar>
             <w:shd w:fill="D9EAF7"/>
           </w:tcPr>
           <w:p>
@@ -562,7 +710,13 @@
         </w:tc>
         <w:tc>
           <w:tcPr>
-            <w:tcW w:w="1491" w:type="dxa"/>
+            <w:tcW w:w="1740" w:type="dxa"/>
+            <w:tcMar>
+              <w:top w:w="55" w:type="dxa"/>
+              <w:start w:w="55" w:type="dxa"/>
+              <w:bottom w:w="55" w:type="dxa"/>
+              <w:end w:w="55" w:type="dxa"/>
+            </w:tcMar>
             <w:shd w:fill="D9EAF7"/>
           </w:tcPr>
           <w:p>
@@ -576,7 +730,13 @@
         </w:tc>
         <w:tc>
           <w:tcPr>
-            <w:tcW w:w="1491" w:type="dxa"/>
+            <w:tcW w:w="1740" w:type="dxa"/>
+            <w:tcMar>
+              <w:top w:w="55" w:type="dxa"/>
+              <w:start w:w="55" w:type="dxa"/>
+              <w:bottom w:w="55" w:type="dxa"/>
+              <w:end w:w="55" w:type="dxa"/>
+            </w:tcMar>
             <w:shd w:fill="D9EAF7"/>
           </w:tcPr>
           <w:p>
@@ -590,7 +750,13 @@
         </w:tc>
         <w:tc>
           <w:tcPr>
-            <w:tcW w:w="1491" w:type="dxa"/>
+            <w:tcW w:w="1740" w:type="dxa"/>
+            <w:tcMar>
+              <w:top w:w="55" w:type="dxa"/>
+              <w:start w:w="55" w:type="dxa"/>
+              <w:bottom w:w="55" w:type="dxa"/>
+              <w:end w:w="55" w:type="dxa"/>
+            </w:tcMar>
             <w:shd w:fill="D9EAF7"/>
           </w:tcPr>
           <w:p>
@@ -604,7 +770,13 @@
         </w:tc>
         <w:tc>
           <w:tcPr>
-            <w:tcW w:w="1491" w:type="dxa"/>
+            <w:tcW w:w="1740" w:type="dxa"/>
+            <w:tcMar>
+              <w:top w:w="55" w:type="dxa"/>
+              <w:start w:w="55" w:type="dxa"/>
+              <w:bottom w:w="55" w:type="dxa"/>
+              <w:end w:w="55" w:type="dxa"/>
+            </w:tcMar>
             <w:shd w:fill="D9EAF7"/>
           </w:tcPr>
           <w:p>
@@ -616,25 +788,20 @@
             </w:r>
           </w:p>
         </w:tc>
-        <w:tc>
-          <w:tcPr>
-            <w:tcW w:w="1491" w:type="dxa"/>
-            <w:shd w:fill="D9EAF7"/>
-          </w:tcPr>
-          <w:p>
-            <w:r>
-              <w:rPr>
-                <w:b/>
-              </w:rPr>
-              <w:t xml:space="preserve">Confusion matrix [0,1]</w:t>
-            </w:r>
-          </w:p>
-        </w:tc>
       </w:tr>
       <w:tr>
-        <w:tc>
-          <w:tcPr>
-            <w:tcW w:w="1491" w:type="dxa"/>
+        <w:trPr>
+          <w:cantSplit/>
+        </w:trPr>
+        <w:tc>
+          <w:tcPr>
+            <w:tcW w:w="1740" w:type="dxa"/>
+            <w:tcMar>
+              <w:top w:w="55" w:type="dxa"/>
+              <w:start w:w="55" w:type="dxa"/>
+              <w:bottom w:w="55" w:type="dxa"/>
+              <w:end w:w="55" w:type="dxa"/>
+            </w:tcMar>
           </w:tcPr>
           <w:p>
             <w:r>
@@ -644,7 +811,13 @@
         </w:tc>
         <w:tc>
           <w:tcPr>
-            <w:tcW w:w="1491" w:type="dxa"/>
+            <w:tcW w:w="1740" w:type="dxa"/>
+            <w:tcMar>
+              <w:top w:w="55" w:type="dxa"/>
+              <w:start w:w="55" w:type="dxa"/>
+              <w:bottom w:w="55" w:type="dxa"/>
+              <w:end w:w="55" w:type="dxa"/>
+            </w:tcMar>
           </w:tcPr>
           <w:p>
             <w:r>
@@ -654,7 +827,13 @@
         </w:tc>
         <w:tc>
           <w:tcPr>
-            <w:tcW w:w="1491" w:type="dxa"/>
+            <w:tcW w:w="1740" w:type="dxa"/>
+            <w:tcMar>
+              <w:top w:w="55" w:type="dxa"/>
+              <w:start w:w="55" w:type="dxa"/>
+              <w:bottom w:w="55" w:type="dxa"/>
+              <w:end w:w="55" w:type="dxa"/>
+            </w:tcMar>
           </w:tcPr>
           <w:p>
             <w:r>
@@ -664,7 +843,13 @@
         </w:tc>
         <w:tc>
           <w:tcPr>
-            <w:tcW w:w="1491" w:type="dxa"/>
+            <w:tcW w:w="1740" w:type="dxa"/>
+            <w:tcMar>
+              <w:top w:w="55" w:type="dxa"/>
+              <w:start w:w="55" w:type="dxa"/>
+              <w:bottom w:w="55" w:type="dxa"/>
+              <w:end w:w="55" w:type="dxa"/>
+            </w:tcMar>
           </w:tcPr>
           <w:p>
             <w:r>
@@ -674,7 +859,13 @@
         </w:tc>
         <w:tc>
           <w:tcPr>
-            <w:tcW w:w="1491" w:type="dxa"/>
+            <w:tcW w:w="1740" w:type="dxa"/>
+            <w:tcMar>
+              <w:top w:w="55" w:type="dxa"/>
+              <w:start w:w="55" w:type="dxa"/>
+              <w:bottom w:w="55" w:type="dxa"/>
+              <w:end w:w="55" w:type="dxa"/>
+            </w:tcMar>
           </w:tcPr>
           <w:p>
             <w:r>
@@ -684,29 +875,34 @@
         </w:tc>
         <w:tc>
           <w:tcPr>
-            <w:tcW w:w="1491" w:type="dxa"/>
+            <w:tcW w:w="1740" w:type="dxa"/>
+            <w:tcMar>
+              <w:top w:w="55" w:type="dxa"/>
+              <w:start w:w="55" w:type="dxa"/>
+              <w:bottom w:w="55" w:type="dxa"/>
+              <w:end w:w="55" w:type="dxa"/>
+            </w:tcMar>
           </w:tcPr>
           <w:p>
             <w:r>
               <w:t xml:space="preserve">87.68%</w:t>
-            </w:r>
-          </w:p>
-        </w:tc>
-        <w:tc>
-          <w:tcPr>
-            <w:tcW w:w="1491" w:type="dxa"/>
-          </w:tcPr>
-          <w:p>
-            <w:r>
-              <w:t xml:space="preserve">[[78, 13], [5, 54]]</w:t>
             </w:r>
           </w:p>
         </w:tc>
       </w:tr>
       <w:tr>
-        <w:tc>
-          <w:tcPr>
-            <w:tcW w:w="1491" w:type="dxa"/>
+        <w:trPr>
+          <w:cantSplit/>
+        </w:trPr>
+        <w:tc>
+          <w:tcPr>
+            <w:tcW w:w="1740" w:type="dxa"/>
+            <w:tcMar>
+              <w:top w:w="55" w:type="dxa"/>
+              <w:start w:w="55" w:type="dxa"/>
+              <w:bottom w:w="55" w:type="dxa"/>
+              <w:end w:w="55" w:type="dxa"/>
+            </w:tcMar>
           </w:tcPr>
           <w:p>
             <w:r>
@@ -716,7 +912,13 @@
         </w:tc>
         <w:tc>
           <w:tcPr>
-            <w:tcW w:w="1491" w:type="dxa"/>
+            <w:tcW w:w="1740" w:type="dxa"/>
+            <w:tcMar>
+              <w:top w:w="55" w:type="dxa"/>
+              <w:start w:w="55" w:type="dxa"/>
+              <w:bottom w:w="55" w:type="dxa"/>
+              <w:end w:w="55" w:type="dxa"/>
+            </w:tcMar>
           </w:tcPr>
           <w:p>
             <w:r>
@@ -726,7 +928,13 @@
         </w:tc>
         <w:tc>
           <w:tcPr>
-            <w:tcW w:w="1491" w:type="dxa"/>
+            <w:tcW w:w="1740" w:type="dxa"/>
+            <w:tcMar>
+              <w:top w:w="55" w:type="dxa"/>
+              <w:start w:w="55" w:type="dxa"/>
+              <w:bottom w:w="55" w:type="dxa"/>
+              <w:end w:w="55" w:type="dxa"/>
+            </w:tcMar>
           </w:tcPr>
           <w:p>
             <w:r>
@@ -736,7 +944,13 @@
         </w:tc>
         <w:tc>
           <w:tcPr>
-            <w:tcW w:w="1491" w:type="dxa"/>
+            <w:tcW w:w="1740" w:type="dxa"/>
+            <w:tcMar>
+              <w:top w:w="55" w:type="dxa"/>
+              <w:start w:w="55" w:type="dxa"/>
+              <w:bottom w:w="55" w:type="dxa"/>
+              <w:end w:w="55" w:type="dxa"/>
+            </w:tcMar>
           </w:tcPr>
           <w:p>
             <w:r>
@@ -746,7 +960,13 @@
         </w:tc>
         <w:tc>
           <w:tcPr>
-            <w:tcW w:w="1491" w:type="dxa"/>
+            <w:tcW w:w="1740" w:type="dxa"/>
+            <w:tcMar>
+              <w:top w:w="55" w:type="dxa"/>
+              <w:start w:w="55" w:type="dxa"/>
+              <w:bottom w:w="55" w:type="dxa"/>
+              <w:end w:w="55" w:type="dxa"/>
+            </w:tcMar>
           </w:tcPr>
           <w:p>
             <w:r>
@@ -756,21 +976,17 @@
         </w:tc>
         <w:tc>
           <w:tcPr>
-            <w:tcW w:w="1491" w:type="dxa"/>
+            <w:tcW w:w="1740" w:type="dxa"/>
+            <w:tcMar>
+              <w:top w:w="55" w:type="dxa"/>
+              <w:start w:w="55" w:type="dxa"/>
+              <w:bottom w:w="55" w:type="dxa"/>
+              <w:end w:w="55" w:type="dxa"/>
+            </w:tcMar>
           </w:tcPr>
           <w:p>
             <w:r>
               <w:t xml:space="preserve">85.60%</w:t>
-            </w:r>
-          </w:p>
-        </w:tc>
-        <w:tc>
-          <w:tcPr>
-            <w:tcW w:w="1491" w:type="dxa"/>
-          </w:tcPr>
-          <w:p>
-            <w:r>
-              <w:t xml:space="preserve">[[77, 14], [7, 52]]</w:t>
             </w:r>
           </w:p>
         </w:tc>
@@ -822,8 +1038,15 @@
         <w:t xml:space="preserve">All values below are transcribed from the existing result JSONs. Precision/Recall/F1 are binary scores for True (label 1). No missing metric is reconstructed.</w:t>
       </w:r>
     </w:p>
+    <w:p>
+      <w:pPr/>
+      <w:r>
+        <w:t xml:space="preserve">The text models were evaluated on all 59,163 official test rows. ResNet-50 and both fusion variants were evaluated on the same 150-example held-out image subset, with labels 0=Fake and 1=True. Do not compare the full-split text metrics and subset image/fusion metrics as if their test scopes were equivalent.</w:t>
+      </w:r>
+    </w:p>
     <w:tbl>
       <w:tblPr>
+        <w:tblLayout w:type="fixed"/>
         <w:tblW w:w="10440" w:type="dxa"/>
         <w:tblBorders>
           <w:top w:val="single" w:sz="4" w:color="A0A0A0"/>
@@ -835,18 +1058,26 @@
         </w:tblBorders>
       </w:tblPr>
       <w:tblGrid>
-        <w:gridCol w:w="1491"/>
-        <w:gridCol w:w="1491"/>
-        <w:gridCol w:w="1491"/>
-        <w:gridCol w:w="1491"/>
-        <w:gridCol w:w="1491"/>
-        <w:gridCol w:w="1491"/>
-        <w:gridCol w:w="1491"/>
+        <w:gridCol w:w="1740"/>
+        <w:gridCol w:w="1740"/>
+        <w:gridCol w:w="1740"/>
+        <w:gridCol w:w="1740"/>
+        <w:gridCol w:w="1740"/>
+        <w:gridCol w:w="1740"/>
       </w:tblGrid>
       <w:tr>
-        <w:tc>
-          <w:tcPr>
-            <w:tcW w:w="1491" w:type="dxa"/>
+        <w:trPr>
+          <w:tblHeader w:val="true"/>
+        </w:trPr>
+        <w:tc>
+          <w:tcPr>
+            <w:tcW w:w="1740" w:type="dxa"/>
+            <w:tcMar>
+              <w:top w:w="55" w:type="dxa"/>
+              <w:start w:w="55" w:type="dxa"/>
+              <w:bottom w:w="55" w:type="dxa"/>
+              <w:end w:w="55" w:type="dxa"/>
+            </w:tcMar>
             <w:shd w:fill="D9EAF7"/>
           </w:tcPr>
           <w:p>
@@ -854,13 +1085,19 @@
               <w:rPr>
                 <w:b/>
               </w:rPr>
-              <w:t xml:space="preserve">Model</w:t>
-            </w:r>
-          </w:p>
-        </w:tc>
-        <w:tc>
-          <w:tcPr>
-            <w:tcW w:w="1491" w:type="dxa"/>
+              <w:t xml:space="preserve">Full-test text system</w:t>
+            </w:r>
+          </w:p>
+        </w:tc>
+        <w:tc>
+          <w:tcPr>
+            <w:tcW w:w="1740" w:type="dxa"/>
+            <w:tcMar>
+              <w:top w:w="55" w:type="dxa"/>
+              <w:start w:w="55" w:type="dxa"/>
+              <w:bottom w:w="55" w:type="dxa"/>
+              <w:end w:w="55" w:type="dxa"/>
+            </w:tcMar>
             <w:shd w:fill="D9EAF7"/>
           </w:tcPr>
           <w:p>
@@ -868,13 +1105,19 @@
               <w:rPr>
                 <w:b/>
               </w:rPr>
-              <w:t xml:space="preserve">Test accuracy</w:t>
-            </w:r>
-          </w:p>
-        </w:tc>
-        <w:tc>
-          <w:tcPr>
-            <w:tcW w:w="1491" w:type="dxa"/>
+              <w:t xml:space="preserve">Accuracy</w:t>
+            </w:r>
+          </w:p>
+        </w:tc>
+        <w:tc>
+          <w:tcPr>
+            <w:tcW w:w="1740" w:type="dxa"/>
+            <w:tcMar>
+              <w:top w:w="55" w:type="dxa"/>
+              <w:start w:w="55" w:type="dxa"/>
+              <w:bottom w:w="55" w:type="dxa"/>
+              <w:end w:w="55" w:type="dxa"/>
+            </w:tcMar>
             <w:shd w:fill="D9EAF7"/>
           </w:tcPr>
           <w:p>
@@ -882,13 +1125,19 @@
               <w:rPr>
                 <w:b/>
               </w:rPr>
-              <w:t xml:space="preserve">Precision</w:t>
-            </w:r>
-          </w:p>
-        </w:tc>
-        <w:tc>
-          <w:tcPr>
-            <w:tcW w:w="1491" w:type="dxa"/>
+              <w:t xml:space="preserve">Precision (True)</w:t>
+            </w:r>
+          </w:p>
+        </w:tc>
+        <w:tc>
+          <w:tcPr>
+            <w:tcW w:w="1740" w:type="dxa"/>
+            <w:tcMar>
+              <w:top w:w="55" w:type="dxa"/>
+              <w:start w:w="55" w:type="dxa"/>
+              <w:bottom w:w="55" w:type="dxa"/>
+              <w:end w:w="55" w:type="dxa"/>
+            </w:tcMar>
             <w:shd w:fill="D9EAF7"/>
           </w:tcPr>
           <w:p>
@@ -896,13 +1145,19 @@
               <w:rPr>
                 <w:b/>
               </w:rPr>
-              <w:t xml:space="preserve">Recall</w:t>
-            </w:r>
-          </w:p>
-        </w:tc>
-        <w:tc>
-          <w:tcPr>
-            <w:tcW w:w="1491" w:type="dxa"/>
+              <w:t xml:space="preserve">Recall (True)</w:t>
+            </w:r>
+          </w:p>
+        </w:tc>
+        <w:tc>
+          <w:tcPr>
+            <w:tcW w:w="1740" w:type="dxa"/>
+            <w:tcMar>
+              <w:top w:w="55" w:type="dxa"/>
+              <w:start w:w="55" w:type="dxa"/>
+              <w:bottom w:w="55" w:type="dxa"/>
+              <w:end w:w="55" w:type="dxa"/>
+            </w:tcMar>
             <w:shd w:fill="D9EAF7"/>
           </w:tcPr>
           <w:p>
@@ -910,13 +1165,19 @@
               <w:rPr>
                 <w:b/>
               </w:rPr>
-              <w:t xml:space="preserve">F1</w:t>
-            </w:r>
-          </w:p>
-        </w:tc>
-        <w:tc>
-          <w:tcPr>
-            <w:tcW w:w="1491" w:type="dxa"/>
+              <w:t xml:space="preserve">F1 (True)</w:t>
+            </w:r>
+          </w:p>
+        </w:tc>
+        <w:tc>
+          <w:tcPr>
+            <w:tcW w:w="1740" w:type="dxa"/>
+            <w:tcMar>
+              <w:top w:w="55" w:type="dxa"/>
+              <w:start w:w="55" w:type="dxa"/>
+              <w:bottom w:w="55" w:type="dxa"/>
+              <w:end w:w="55" w:type="dxa"/>
+            </w:tcMar>
             <w:shd w:fill="D9EAF7"/>
           </w:tcPr>
           <w:p>
@@ -928,9 +1189,244 @@
             </w:r>
           </w:p>
         </w:tc>
-        <w:tc>
-          <w:tcPr>
-            <w:tcW w:w="1491" w:type="dxa"/>
+      </w:tr>
+      <w:tr>
+        <w:trPr>
+          <w:cantSplit/>
+        </w:trPr>
+        <w:tc>
+          <w:tcPr>
+            <w:tcW w:w="1740" w:type="dxa"/>
+            <w:tcMar>
+              <w:top w:w="55" w:type="dxa"/>
+              <w:start w:w="55" w:type="dxa"/>
+              <w:bottom w:w="55" w:type="dxa"/>
+              <w:end w:w="55" w:type="dxa"/>
+            </w:tcMar>
+          </w:tcPr>
+          <w:p>
+            <w:r>
+              <w:t xml:space="preserve">TF-IDF + Logistic Regression</w:t>
+            </w:r>
+          </w:p>
+        </w:tc>
+        <w:tc>
+          <w:tcPr>
+            <w:tcW w:w="1740" w:type="dxa"/>
+            <w:tcMar>
+              <w:top w:w="55" w:type="dxa"/>
+              <w:start w:w="55" w:type="dxa"/>
+              <w:bottom w:w="55" w:type="dxa"/>
+              <w:end w:w="55" w:type="dxa"/>
+            </w:tcMar>
+          </w:tcPr>
+          <w:p>
+            <w:r>
+              <w:t xml:space="preserve">83.52%</w:t>
+            </w:r>
+          </w:p>
+        </w:tc>
+        <w:tc>
+          <w:tcPr>
+            <w:tcW w:w="1740" w:type="dxa"/>
+            <w:tcMar>
+              <w:top w:w="55" w:type="dxa"/>
+              <w:start w:w="55" w:type="dxa"/>
+              <w:bottom w:w="55" w:type="dxa"/>
+              <w:end w:w="55" w:type="dxa"/>
+            </w:tcMar>
+          </w:tcPr>
+          <w:p>
+            <w:r>
+              <w:t xml:space="preserve">76.28%</w:t>
+            </w:r>
+          </w:p>
+        </w:tc>
+        <w:tc>
+          <w:tcPr>
+            <w:tcW w:w="1740" w:type="dxa"/>
+            <w:tcMar>
+              <w:top w:w="55" w:type="dxa"/>
+              <w:start w:w="55" w:type="dxa"/>
+              <w:bottom w:w="55" w:type="dxa"/>
+              <w:end w:w="55" w:type="dxa"/>
+            </w:tcMar>
+          </w:tcPr>
+          <w:p>
+            <w:r>
+              <w:t xml:space="preserve">84.66%</w:t>
+            </w:r>
+          </w:p>
+        </w:tc>
+        <w:tc>
+          <w:tcPr>
+            <w:tcW w:w="1740" w:type="dxa"/>
+            <w:tcMar>
+              <w:top w:w="55" w:type="dxa"/>
+              <w:start w:w="55" w:type="dxa"/>
+              <w:bottom w:w="55" w:type="dxa"/>
+              <w:end w:w="55" w:type="dxa"/>
+            </w:tcMar>
+          </w:tcPr>
+          <w:p>
+            <w:r>
+              <w:t xml:space="preserve">80.25%</w:t>
+            </w:r>
+          </w:p>
+        </w:tc>
+        <w:tc>
+          <w:tcPr>
+            <w:tcW w:w="1740" w:type="dxa"/>
+            <w:tcMar>
+              <w:top w:w="55" w:type="dxa"/>
+              <w:start w:w="55" w:type="dxa"/>
+              <w:bottom w:w="55" w:type="dxa"/>
+              <w:end w:w="55" w:type="dxa"/>
+            </w:tcMar>
+          </w:tcPr>
+          <w:p>
+            <w:r>
+              <w:t xml:space="preserve">Not recorded</w:t>
+            </w:r>
+          </w:p>
+        </w:tc>
+      </w:tr>
+      <w:tr>
+        <w:trPr>
+          <w:cantSplit/>
+        </w:trPr>
+        <w:tc>
+          <w:tcPr>
+            <w:tcW w:w="1740" w:type="dxa"/>
+            <w:tcMar>
+              <w:top w:w="55" w:type="dxa"/>
+              <w:start w:w="55" w:type="dxa"/>
+              <w:bottom w:w="55" w:type="dxa"/>
+              <w:end w:w="55" w:type="dxa"/>
+            </w:tcMar>
+          </w:tcPr>
+          <w:p>
+            <w:r>
+              <w:t xml:space="preserve">DistilBERT</w:t>
+            </w:r>
+          </w:p>
+        </w:tc>
+        <w:tc>
+          <w:tcPr>
+            <w:tcW w:w="1740" w:type="dxa"/>
+            <w:tcMar>
+              <w:top w:w="55" w:type="dxa"/>
+              <w:start w:w="55" w:type="dxa"/>
+              <w:bottom w:w="55" w:type="dxa"/>
+              <w:end w:w="55" w:type="dxa"/>
+            </w:tcMar>
+          </w:tcPr>
+          <w:p>
+            <w:r>
+              <w:t xml:space="preserve">83.35%</w:t>
+            </w:r>
+          </w:p>
+        </w:tc>
+        <w:tc>
+          <w:tcPr>
+            <w:tcW w:w="1740" w:type="dxa"/>
+            <w:tcMar>
+              <w:top w:w="55" w:type="dxa"/>
+              <w:start w:w="55" w:type="dxa"/>
+              <w:bottom w:w="55" w:type="dxa"/>
+              <w:end w:w="55" w:type="dxa"/>
+            </w:tcMar>
+          </w:tcPr>
+          <w:p>
+            <w:r>
+              <w:t xml:space="preserve">76.55%</w:t>
+            </w:r>
+          </w:p>
+        </w:tc>
+        <w:tc>
+          <w:tcPr>
+            <w:tcW w:w="1740" w:type="dxa"/>
+            <w:tcMar>
+              <w:top w:w="55" w:type="dxa"/>
+              <w:start w:w="55" w:type="dxa"/>
+              <w:bottom w:w="55" w:type="dxa"/>
+              <w:end w:w="55" w:type="dxa"/>
+            </w:tcMar>
+          </w:tcPr>
+          <w:p>
+            <w:r>
+              <w:t xml:space="preserve">83.48%</w:t>
+            </w:r>
+          </w:p>
+        </w:tc>
+        <w:tc>
+          <w:tcPr>
+            <w:tcW w:w="1740" w:type="dxa"/>
+            <w:tcMar>
+              <w:top w:w="55" w:type="dxa"/>
+              <w:start w:w="55" w:type="dxa"/>
+              <w:bottom w:w="55" w:type="dxa"/>
+              <w:end w:w="55" w:type="dxa"/>
+            </w:tcMar>
+          </w:tcPr>
+          <w:p>
+            <w:r>
+              <w:t xml:space="preserve">79.87%</w:t>
+            </w:r>
+          </w:p>
+        </w:tc>
+        <w:tc>
+          <w:tcPr>
+            <w:tcW w:w="1740" w:type="dxa"/>
+            <w:tcMar>
+              <w:top w:w="55" w:type="dxa"/>
+              <w:start w:w="55" w:type="dxa"/>
+              <w:bottom w:w="55" w:type="dxa"/>
+              <w:end w:w="55" w:type="dxa"/>
+            </w:tcMar>
+          </w:tcPr>
+          <w:p>
+            <w:r>
+              <w:t xml:space="preserve">82.84%</w:t>
+            </w:r>
+          </w:p>
+        </w:tc>
+      </w:tr>
+    </w:tbl>
+    <w:tbl>
+      <w:tblPr>
+        <w:tblLayout w:type="fixed"/>
+        <w:tblW w:w="10440" w:type="dxa"/>
+        <w:tblBorders>
+          <w:top w:val="single" w:sz="4" w:color="A0A0A0"/>
+          <w:left w:val="single" w:sz="4" w:color="A0A0A0"/>
+          <w:bottom w:val="single" w:sz="4" w:color="A0A0A0"/>
+          <w:right w:val="single" w:sz="4" w:color="A0A0A0"/>
+          <w:insideH w:val="single" w:sz="4" w:color="A0A0A0"/>
+          <w:insideV w:val="single" w:sz="4" w:color="A0A0A0"/>
+        </w:tblBorders>
+      </w:tblPr>
+      <w:tblGrid>
+        <w:gridCol w:w="1740"/>
+        <w:gridCol w:w="1740"/>
+        <w:gridCol w:w="1740"/>
+        <w:gridCol w:w="1740"/>
+        <w:gridCol w:w="1740"/>
+        <w:gridCol w:w="1740"/>
+      </w:tblGrid>
+      <w:tr>
+        <w:trPr>
+          <w:tblHeader w:val="true"/>
+        </w:trPr>
+        <w:tc>
+          <w:tcPr>
+            <w:tcW w:w="1740" w:type="dxa"/>
+            <w:tcMar>
+              <w:top w:w="55" w:type="dxa"/>
+              <w:start w:w="55" w:type="dxa"/>
+              <w:bottom w:w="55" w:type="dxa"/>
+              <w:end w:w="55" w:type="dxa"/>
+            </w:tcMar>
             <w:shd w:fill="D9EAF7"/>
           </w:tcPr>
           <w:p>
@@ -938,313 +1434,342 @@
               <w:rPr>
                 <w:b/>
               </w:rPr>
-              <w:t xml:space="preserve">Test examples</w:t>
+              <w:t xml:space="preserve">Image / aligned-fusion system</w:t>
+            </w:r>
+          </w:p>
+        </w:tc>
+        <w:tc>
+          <w:tcPr>
+            <w:tcW w:w="1740" w:type="dxa"/>
+            <w:tcMar>
+              <w:top w:w="55" w:type="dxa"/>
+              <w:start w:w="55" w:type="dxa"/>
+              <w:bottom w:w="55" w:type="dxa"/>
+              <w:end w:w="55" w:type="dxa"/>
+            </w:tcMar>
+            <w:shd w:fill="D9EAF7"/>
+          </w:tcPr>
+          <w:p>
+            <w:r>
+              <w:rPr>
+                <w:b/>
+              </w:rPr>
+              <w:t xml:space="preserve">Accuracy</w:t>
+            </w:r>
+          </w:p>
+        </w:tc>
+        <w:tc>
+          <w:tcPr>
+            <w:tcW w:w="1740" w:type="dxa"/>
+            <w:tcMar>
+              <w:top w:w="55" w:type="dxa"/>
+              <w:start w:w="55" w:type="dxa"/>
+              <w:bottom w:w="55" w:type="dxa"/>
+              <w:end w:w="55" w:type="dxa"/>
+            </w:tcMar>
+            <w:shd w:fill="D9EAF7"/>
+          </w:tcPr>
+          <w:p>
+            <w:r>
+              <w:rPr>
+                <w:b/>
+              </w:rPr>
+              <w:t xml:space="preserve">Precision (True)</w:t>
+            </w:r>
+          </w:p>
+        </w:tc>
+        <w:tc>
+          <w:tcPr>
+            <w:tcW w:w="1740" w:type="dxa"/>
+            <w:tcMar>
+              <w:top w:w="55" w:type="dxa"/>
+              <w:start w:w="55" w:type="dxa"/>
+              <w:bottom w:w="55" w:type="dxa"/>
+              <w:end w:w="55" w:type="dxa"/>
+            </w:tcMar>
+            <w:shd w:fill="D9EAF7"/>
+          </w:tcPr>
+          <w:p>
+            <w:r>
+              <w:rPr>
+                <w:b/>
+              </w:rPr>
+              <w:t xml:space="preserve">Recall (True)</w:t>
+            </w:r>
+          </w:p>
+        </w:tc>
+        <w:tc>
+          <w:tcPr>
+            <w:tcW w:w="1740" w:type="dxa"/>
+            <w:tcMar>
+              <w:top w:w="55" w:type="dxa"/>
+              <w:start w:w="55" w:type="dxa"/>
+              <w:bottom w:w="55" w:type="dxa"/>
+              <w:end w:w="55" w:type="dxa"/>
+            </w:tcMar>
+            <w:shd w:fill="D9EAF7"/>
+          </w:tcPr>
+          <w:p>
+            <w:r>
+              <w:rPr>
+                <w:b/>
+              </w:rPr>
+              <w:t xml:space="preserve">F1 (True)</w:t>
+            </w:r>
+          </w:p>
+        </w:tc>
+        <w:tc>
+          <w:tcPr>
+            <w:tcW w:w="1740" w:type="dxa"/>
+            <w:tcMar>
+              <w:top w:w="55" w:type="dxa"/>
+              <w:start w:w="55" w:type="dxa"/>
+              <w:bottom w:w="55" w:type="dxa"/>
+              <w:end w:w="55" w:type="dxa"/>
+            </w:tcMar>
+            <w:shd w:fill="D9EAF7"/>
+          </w:tcPr>
+          <w:p>
+            <w:r>
+              <w:rPr>
+                <w:b/>
+              </w:rPr>
+              <w:t xml:space="preserve">Macro F1</w:t>
             </w:r>
           </w:p>
         </w:tc>
       </w:tr>
       <w:tr>
-        <w:tc>
-          <w:tcPr>
-            <w:tcW w:w="1491" w:type="dxa"/>
-          </w:tcPr>
-          <w:p>
-            <w:r>
-              <w:t xml:space="preserve">TF-IDF + Logistic Regression</w:t>
-            </w:r>
-          </w:p>
-        </w:tc>
-        <w:tc>
-          <w:tcPr>
-            <w:tcW w:w="1491" w:type="dxa"/>
-          </w:tcPr>
-          <w:p>
-            <w:r>
-              <w:t xml:space="preserve">83.52%</w:t>
-            </w:r>
-          </w:p>
-        </w:tc>
-        <w:tc>
-          <w:tcPr>
-            <w:tcW w:w="1491" w:type="dxa"/>
-          </w:tcPr>
-          <w:p>
-            <w:r>
-              <w:t xml:space="preserve">76.28%</w:t>
-            </w:r>
-          </w:p>
-        </w:tc>
-        <w:tc>
-          <w:tcPr>
-            <w:tcW w:w="1491" w:type="dxa"/>
-          </w:tcPr>
-          <w:p>
-            <w:r>
-              <w:t xml:space="preserve">84.66%</w:t>
-            </w:r>
-          </w:p>
-        </w:tc>
-        <w:tc>
-          <w:tcPr>
-            <w:tcW w:w="1491" w:type="dxa"/>
-          </w:tcPr>
-          <w:p>
-            <w:r>
-              <w:t xml:space="preserve">80.25%</w:t>
-            </w:r>
-          </w:p>
-        </w:tc>
-        <w:tc>
-          <w:tcPr>
-            <w:tcW w:w="1491" w:type="dxa"/>
-          </w:tcPr>
-          <w:p>
-            <w:r>
-              <w:t xml:space="preserve">Not recorded</w:t>
-            </w:r>
-          </w:p>
-        </w:tc>
-        <w:tc>
-          <w:tcPr>
-            <w:tcW w:w="1491" w:type="dxa"/>
-          </w:tcPr>
-          <w:p>
-            <w:r>
-              <w:t xml:space="preserve">59,163</w:t>
+        <w:trPr>
+          <w:cantSplit/>
+        </w:trPr>
+        <w:tc>
+          <w:tcPr>
+            <w:tcW w:w="1740" w:type="dxa"/>
+            <w:tcMar>
+              <w:top w:w="55" w:type="dxa"/>
+              <w:start w:w="55" w:type="dxa"/>
+              <w:bottom w:w="55" w:type="dxa"/>
+              <w:end w:w="55" w:type="dxa"/>
+            </w:tcMar>
+          </w:tcPr>
+          <w:p>
+            <w:r>
+              <w:t xml:space="preserve">ResNet-50 (150 images)</w:t>
+            </w:r>
+          </w:p>
+        </w:tc>
+        <w:tc>
+          <w:tcPr>
+            <w:tcW w:w="1740" w:type="dxa"/>
+            <w:tcMar>
+              <w:top w:w="55" w:type="dxa"/>
+              <w:start w:w="55" w:type="dxa"/>
+              <w:bottom w:w="55" w:type="dxa"/>
+              <w:end w:w="55" w:type="dxa"/>
+            </w:tcMar>
+          </w:tcPr>
+          <w:p>
+            <w:r>
+              <w:t xml:space="preserve">78.67%</w:t>
+            </w:r>
+          </w:p>
+        </w:tc>
+        <w:tc>
+          <w:tcPr>
+            <w:tcW w:w="1740" w:type="dxa"/>
+            <w:tcMar>
+              <w:top w:w="55" w:type="dxa"/>
+              <w:start w:w="55" w:type="dxa"/>
+              <w:bottom w:w="55" w:type="dxa"/>
+              <w:end w:w="55" w:type="dxa"/>
+            </w:tcMar>
+          </w:tcPr>
+          <w:p>
+            <w:r>
+              <w:t xml:space="preserve">70.15%</w:t>
+            </w:r>
+          </w:p>
+        </w:tc>
+        <w:tc>
+          <w:tcPr>
+            <w:tcW w:w="1740" w:type="dxa"/>
+            <w:tcMar>
+              <w:top w:w="55" w:type="dxa"/>
+              <w:start w:w="55" w:type="dxa"/>
+              <w:bottom w:w="55" w:type="dxa"/>
+              <w:end w:w="55" w:type="dxa"/>
+            </w:tcMar>
+          </w:tcPr>
+          <w:p>
+            <w:r>
+              <w:t xml:space="preserve">79.66%</w:t>
+            </w:r>
+          </w:p>
+        </w:tc>
+        <w:tc>
+          <w:tcPr>
+            <w:tcW w:w="1740" w:type="dxa"/>
+            <w:tcMar>
+              <w:top w:w="55" w:type="dxa"/>
+              <w:start w:w="55" w:type="dxa"/>
+              <w:bottom w:w="55" w:type="dxa"/>
+              <w:end w:w="55" w:type="dxa"/>
+            </w:tcMar>
+          </w:tcPr>
+          <w:p>
+            <w:r>
+              <w:t xml:space="preserve">74.60%</w:t>
+            </w:r>
+          </w:p>
+        </w:tc>
+        <w:tc>
+          <w:tcPr>
+            <w:tcW w:w="1740" w:type="dxa"/>
+            <w:tcMar>
+              <w:top w:w="55" w:type="dxa"/>
+              <w:start w:w="55" w:type="dxa"/>
+              <w:bottom w:w="55" w:type="dxa"/>
+              <w:end w:w="55" w:type="dxa"/>
+            </w:tcMar>
+          </w:tcPr>
+          <w:p>
+            <w:r>
+              <w:t xml:space="preserve">78.11%</w:t>
             </w:r>
           </w:p>
         </w:tc>
       </w:tr>
       <w:tr>
-        <w:tc>
-          <w:tcPr>
-            <w:tcW w:w="1491" w:type="dxa"/>
-          </w:tcPr>
-          <w:p>
-            <w:r>
-              <w:t xml:space="preserve">DistilBERT</w:t>
-            </w:r>
-          </w:p>
-        </w:tc>
-        <w:tc>
-          <w:tcPr>
-            <w:tcW w:w="1491" w:type="dxa"/>
-          </w:tcPr>
-          <w:p>
-            <w:r>
-              <w:t xml:space="preserve">83.35%</w:t>
-            </w:r>
-          </w:p>
-        </w:tc>
-        <w:tc>
-          <w:tcPr>
-            <w:tcW w:w="1491" w:type="dxa"/>
-          </w:tcPr>
-          <w:p>
-            <w:r>
-              <w:t xml:space="preserve">76.55%</w:t>
-            </w:r>
-          </w:p>
-        </w:tc>
-        <w:tc>
-          <w:tcPr>
-            <w:tcW w:w="1491" w:type="dxa"/>
-          </w:tcPr>
-          <w:p>
-            <w:r>
-              <w:t xml:space="preserve">83.48%</w:t>
-            </w:r>
-          </w:p>
-        </w:tc>
-        <w:tc>
-          <w:tcPr>
-            <w:tcW w:w="1491" w:type="dxa"/>
-          </w:tcPr>
-          <w:p>
-            <w:r>
-              <w:t xml:space="preserve">79.87%</w:t>
-            </w:r>
-          </w:p>
-        </w:tc>
-        <w:tc>
-          <w:tcPr>
-            <w:tcW w:w="1491" w:type="dxa"/>
-          </w:tcPr>
-          <w:p>
-            <w:r>
-              <w:t xml:space="preserve">82.84%</w:t>
-            </w:r>
-          </w:p>
-        </w:tc>
-        <w:tc>
-          <w:tcPr>
-            <w:tcW w:w="1491" w:type="dxa"/>
-          </w:tcPr>
-          <w:p>
-            <w:r>
-              <w:t xml:space="preserve">59,163</w:t>
+        <w:trPr>
+          <w:cantSplit/>
+        </w:trPr>
+        <w:tc>
+          <w:tcPr>
+            <w:tcW w:w="1740" w:type="dxa"/>
+            <w:tcMar>
+              <w:top w:w="55" w:type="dxa"/>
+              <w:start w:w="55" w:type="dxa"/>
+              <w:bottom w:w="55" w:type="dxa"/>
+              <w:end w:w="55" w:type="dxa"/>
+            </w:tcMar>
+          </w:tcPr>
+          <w:p>
+            <w:r>
+              <w:t xml:space="preserve">TF-IDF + ResNet-50 (alpha=0.63)</w:t>
+            </w:r>
+          </w:p>
+        </w:tc>
+        <w:tc>
+          <w:tcPr>
+            <w:tcW w:w="1740" w:type="dxa"/>
+            <w:tcMar>
+              <w:top w:w="55" w:type="dxa"/>
+              <w:start w:w="55" w:type="dxa"/>
+              <w:bottom w:w="55" w:type="dxa"/>
+              <w:end w:w="55" w:type="dxa"/>
+            </w:tcMar>
+          </w:tcPr>
+          <w:p>
+            <w:r>
+              <w:t xml:space="preserve">88.00%</w:t>
+            </w:r>
+          </w:p>
+        </w:tc>
+        <w:tc>
+          <w:tcPr>
+            <w:tcW w:w="1740" w:type="dxa"/>
+            <w:tcMar>
+              <w:top w:w="55" w:type="dxa"/>
+              <w:start w:w="55" w:type="dxa"/>
+              <w:bottom w:w="55" w:type="dxa"/>
+              <w:end w:w="55" w:type="dxa"/>
+            </w:tcMar>
+          </w:tcPr>
+          <w:p>
+            <w:r>
+              <w:t xml:space="preserve">80.60%</w:t>
+            </w:r>
+          </w:p>
+        </w:tc>
+        <w:tc>
+          <w:tcPr>
+            <w:tcW w:w="1740" w:type="dxa"/>
+            <w:tcMar>
+              <w:top w:w="55" w:type="dxa"/>
+              <w:start w:w="55" w:type="dxa"/>
+              <w:bottom w:w="55" w:type="dxa"/>
+              <w:end w:w="55" w:type="dxa"/>
+            </w:tcMar>
+          </w:tcPr>
+          <w:p>
+            <w:r>
+              <w:t xml:space="preserve">91.53%</w:t>
+            </w:r>
+          </w:p>
+        </w:tc>
+        <w:tc>
+          <w:tcPr>
+            <w:tcW w:w="1740" w:type="dxa"/>
+            <w:tcMar>
+              <w:top w:w="55" w:type="dxa"/>
+              <w:start w:w="55" w:type="dxa"/>
+              <w:bottom w:w="55" w:type="dxa"/>
+              <w:end w:w="55" w:type="dxa"/>
+            </w:tcMar>
+          </w:tcPr>
+          <w:p>
+            <w:r>
+              <w:t xml:space="preserve">85.71%</w:t>
+            </w:r>
+          </w:p>
+        </w:tc>
+        <w:tc>
+          <w:tcPr>
+            <w:tcW w:w="1740" w:type="dxa"/>
+            <w:tcMar>
+              <w:top w:w="55" w:type="dxa"/>
+              <w:start w:w="55" w:type="dxa"/>
+              <w:bottom w:w="55" w:type="dxa"/>
+              <w:end w:w="55" w:type="dxa"/>
+            </w:tcMar>
+          </w:tcPr>
+          <w:p>
+            <w:r>
+              <w:t xml:space="preserve">87.68%</w:t>
             </w:r>
           </w:p>
         </w:tc>
       </w:tr>
       <w:tr>
-        <w:tc>
-          <w:tcPr>
-            <w:tcW w:w="1491" w:type="dxa"/>
-          </w:tcPr>
-          <w:p>
-            <w:r>
-              <w:t xml:space="preserve">ResNet-50</w:t>
-            </w:r>
-          </w:p>
-        </w:tc>
-        <w:tc>
-          <w:tcPr>
-            <w:tcW w:w="1491" w:type="dxa"/>
-          </w:tcPr>
-          <w:p>
-            <w:r>
-              <w:t xml:space="preserve">78.67%</w:t>
-            </w:r>
-          </w:p>
-        </w:tc>
-        <w:tc>
-          <w:tcPr>
-            <w:tcW w:w="1491" w:type="dxa"/>
-          </w:tcPr>
-          <w:p>
-            <w:r>
-              <w:t xml:space="preserve">70.15%</w:t>
-            </w:r>
-          </w:p>
-        </w:tc>
-        <w:tc>
-          <w:tcPr>
-            <w:tcW w:w="1491" w:type="dxa"/>
-          </w:tcPr>
-          <w:p>
-            <w:r>
-              <w:t xml:space="preserve">79.66%</w:t>
-            </w:r>
-          </w:p>
-        </w:tc>
-        <w:tc>
-          <w:tcPr>
-            <w:tcW w:w="1491" w:type="dxa"/>
-          </w:tcPr>
-          <w:p>
-            <w:r>
-              <w:t xml:space="preserve">74.60%</w:t>
-            </w:r>
-          </w:p>
-        </w:tc>
-        <w:tc>
-          <w:tcPr>
-            <w:tcW w:w="1491" w:type="dxa"/>
-          </w:tcPr>
-          <w:p>
-            <w:r>
-              <w:t xml:space="preserve">78.11%</w:t>
-            </w:r>
-          </w:p>
-        </w:tc>
-        <w:tc>
-          <w:tcPr>
-            <w:tcW w:w="1491" w:type="dxa"/>
-          </w:tcPr>
-          <w:p>
-            <w:r>
-              <w:t xml:space="preserve">150 images</w:t>
-            </w:r>
-          </w:p>
-        </w:tc>
-      </w:tr>
-      <w:tr>
-        <w:tc>
-          <w:tcPr>
-            <w:tcW w:w="1491" w:type="dxa"/>
-          </w:tcPr>
-          <w:p>
-            <w:r>
-              <w:t xml:space="preserve">TF-IDF + ResNet-50 fusion</w:t>
-            </w:r>
-          </w:p>
-        </w:tc>
-        <w:tc>
-          <w:tcPr>
-            <w:tcW w:w="1491" w:type="dxa"/>
-          </w:tcPr>
-          <w:p>
-            <w:r>
-              <w:t xml:space="preserve">88.00%</w:t>
-            </w:r>
-          </w:p>
-        </w:tc>
-        <w:tc>
-          <w:tcPr>
-            <w:tcW w:w="1491" w:type="dxa"/>
-          </w:tcPr>
-          <w:p>
-            <w:r>
-              <w:t xml:space="preserve">80.60%</w:t>
-            </w:r>
-          </w:p>
-        </w:tc>
-        <w:tc>
-          <w:tcPr>
-            <w:tcW w:w="1491" w:type="dxa"/>
-          </w:tcPr>
-          <w:p>
-            <w:r>
-              <w:t xml:space="preserve">91.53%</w:t>
-            </w:r>
-          </w:p>
-        </w:tc>
-        <w:tc>
-          <w:tcPr>
-            <w:tcW w:w="1491" w:type="dxa"/>
-          </w:tcPr>
-          <w:p>
-            <w:r>
-              <w:t xml:space="preserve">85.71%</w:t>
-            </w:r>
-          </w:p>
-        </w:tc>
-        <w:tc>
-          <w:tcPr>
-            <w:tcW w:w="1491" w:type="dxa"/>
-          </w:tcPr>
-          <w:p>
-            <w:r>
-              <w:t xml:space="preserve">87.68%</w:t>
-            </w:r>
-          </w:p>
-        </w:tc>
-        <w:tc>
-          <w:tcPr>
-            <w:tcW w:w="1491" w:type="dxa"/>
-          </w:tcPr>
-          <w:p>
-            <w:r>
-              <w:t xml:space="preserve">150 aligned test examples</w:t>
-            </w:r>
-          </w:p>
-        </w:tc>
-      </w:tr>
-      <w:tr>
-        <w:tc>
-          <w:tcPr>
-            <w:tcW w:w="1491" w:type="dxa"/>
-          </w:tcPr>
-          <w:p>
-            <w:r>
-              <w:t xml:space="preserve">DistilBERT + ResNet-50 fusion</w:t>
-            </w:r>
-          </w:p>
-        </w:tc>
-        <w:tc>
-          <w:tcPr>
-            <w:tcW w:w="1491" w:type="dxa"/>
+        <w:trPr>
+          <w:cantSplit/>
+        </w:trPr>
+        <w:tc>
+          <w:tcPr>
+            <w:tcW w:w="1740" w:type="dxa"/>
+            <w:tcMar>
+              <w:top w:w="55" w:type="dxa"/>
+              <w:start w:w="55" w:type="dxa"/>
+              <w:bottom w:w="55" w:type="dxa"/>
+              <w:end w:w="55" w:type="dxa"/>
+            </w:tcMar>
+          </w:tcPr>
+          <w:p>
+            <w:r>
+              <w:t xml:space="preserve">DistilBERT + ResNet-50 (alpha=0.38)</w:t>
+            </w:r>
+          </w:p>
+        </w:tc>
+        <w:tc>
+          <w:tcPr>
+            <w:tcW w:w="1740" w:type="dxa"/>
+            <w:tcMar>
+              <w:top w:w="55" w:type="dxa"/>
+              <w:start w:w="55" w:type="dxa"/>
+              <w:bottom w:w="55" w:type="dxa"/>
+              <w:end w:w="55" w:type="dxa"/>
+            </w:tcMar>
           </w:tcPr>
           <w:p>
             <w:r>
@@ -1254,7 +1779,13 @@
         </w:tc>
         <w:tc>
           <w:tcPr>
-            <w:tcW w:w="1491" w:type="dxa"/>
+            <w:tcW w:w="1740" w:type="dxa"/>
+            <w:tcMar>
+              <w:top w:w="55" w:type="dxa"/>
+              <w:start w:w="55" w:type="dxa"/>
+              <w:bottom w:w="55" w:type="dxa"/>
+              <w:end w:w="55" w:type="dxa"/>
+            </w:tcMar>
           </w:tcPr>
           <w:p>
             <w:r>
@@ -1264,7 +1795,13 @@
         </w:tc>
         <w:tc>
           <w:tcPr>
-            <w:tcW w:w="1491" w:type="dxa"/>
+            <w:tcW w:w="1740" w:type="dxa"/>
+            <w:tcMar>
+              <w:top w:w="55" w:type="dxa"/>
+              <w:start w:w="55" w:type="dxa"/>
+              <w:bottom w:w="55" w:type="dxa"/>
+              <w:end w:w="55" w:type="dxa"/>
+            </w:tcMar>
           </w:tcPr>
           <w:p>
             <w:r>
@@ -1274,7 +1811,13 @@
         </w:tc>
         <w:tc>
           <w:tcPr>
-            <w:tcW w:w="1491" w:type="dxa"/>
+            <w:tcW w:w="1740" w:type="dxa"/>
+            <w:tcMar>
+              <w:top w:w="55" w:type="dxa"/>
+              <w:start w:w="55" w:type="dxa"/>
+              <w:bottom w:w="55" w:type="dxa"/>
+              <w:end w:w="55" w:type="dxa"/>
+            </w:tcMar>
           </w:tcPr>
           <w:p>
             <w:r>
@@ -1284,21 +1827,17 @@
         </w:tc>
         <w:tc>
           <w:tcPr>
-            <w:tcW w:w="1491" w:type="dxa"/>
+            <w:tcW w:w="1740" w:type="dxa"/>
+            <w:tcMar>
+              <w:top w:w="55" w:type="dxa"/>
+              <w:start w:w="55" w:type="dxa"/>
+              <w:bottom w:w="55" w:type="dxa"/>
+              <w:end w:w="55" w:type="dxa"/>
+            </w:tcMar>
           </w:tcPr>
           <w:p>
             <w:r>
               <w:t xml:space="preserve">85.60%</w:t>
-            </w:r>
-          </w:p>
-        </w:tc>
-        <w:tc>
-          <w:tcPr>
-            <w:tcW w:w="1491" w:type="dxa"/>
-          </w:tcPr>
-          <w:p>
-            <w:r>
-              <w:t xml:space="preserve">150 aligned test examples</w:t>
             </w:r>
           </w:p>
         </w:tc>
@@ -1318,6 +1857,7 @@
     </w:p>
     <w:tbl>
       <w:tblPr>
+        <w:tblLayout w:type="fixed"/>
         <w:tblW w:w="10440" w:type="dxa"/>
         <w:tblBorders>
           <w:top w:val="single" w:sz="4" w:color="A0A0A0"/>
@@ -1333,9 +1873,18 @@
         <w:gridCol w:w="5220"/>
       </w:tblGrid>
       <w:tr>
+        <w:trPr>
+          <w:tblHeader w:val="true"/>
+        </w:trPr>
         <w:tc>
           <w:tcPr>
             <w:tcW w:w="5220" w:type="dxa"/>
+            <w:tcMar>
+              <w:top w:w="55" w:type="dxa"/>
+              <w:start w:w="55" w:type="dxa"/>
+              <w:bottom w:w="55" w:type="dxa"/>
+              <w:end w:w="55" w:type="dxa"/>
+            </w:tcMar>
             <w:shd w:fill="D9EAF7"/>
           </w:tcPr>
           <w:p>
@@ -1350,6 +1899,12 @@
         <w:tc>
           <w:tcPr>
             <w:tcW w:w="5220" w:type="dxa"/>
+            <w:tcMar>
+              <w:top w:w="55" w:type="dxa"/>
+              <w:start w:w="55" w:type="dxa"/>
+              <w:bottom w:w="55" w:type="dxa"/>
+              <w:end w:w="55" w:type="dxa"/>
+            </w:tcMar>
             <w:shd w:fill="D9EAF7"/>
           </w:tcPr>
           <w:p>
@@ -1363,9 +1918,18 @@
         </w:tc>
       </w:tr>
       <w:tr>
+        <w:trPr>
+          <w:cantSplit/>
+        </w:trPr>
         <w:tc>
           <w:tcPr>
             <w:tcW w:w="5220" w:type="dxa"/>
+            <w:tcMar>
+              <w:top w:w="55" w:type="dxa"/>
+              <w:start w:w="55" w:type="dxa"/>
+              <w:bottom w:w="55" w:type="dxa"/>
+              <w:end w:w="55" w:type="dxa"/>
+            </w:tcMar>
           </w:tcPr>
           <w:p>
             <w:r>
@@ -1376,6 +1940,12 @@
         <w:tc>
           <w:tcPr>
             <w:tcW w:w="5220" w:type="dxa"/>
+            <w:tcMar>
+              <w:top w:w="55" w:type="dxa"/>
+              <w:start w:w="55" w:type="dxa"/>
+              <w:bottom w:w="55" w:type="dxa"/>
+              <w:end w:w="55" w:type="dxa"/>
+            </w:tcMar>
           </w:tcPr>
           <w:p>
             <w:r>
@@ -1385,9 +1955,18 @@
         </w:tc>
       </w:tr>
       <w:tr>
+        <w:trPr>
+          <w:cantSplit/>
+        </w:trPr>
         <w:tc>
           <w:tcPr>
             <w:tcW w:w="5220" w:type="dxa"/>
+            <w:tcMar>
+              <w:top w:w="55" w:type="dxa"/>
+              <w:start w:w="55" w:type="dxa"/>
+              <w:bottom w:w="55" w:type="dxa"/>
+              <w:end w:w="55" w:type="dxa"/>
+            </w:tcMar>
           </w:tcPr>
           <w:p>
             <w:r>
@@ -1398,6 +1977,12 @@
         <w:tc>
           <w:tcPr>
             <w:tcW w:w="5220" w:type="dxa"/>
+            <w:tcMar>
+              <w:top w:w="55" w:type="dxa"/>
+              <w:start w:w="55" w:type="dxa"/>
+              <w:bottom w:w="55" w:type="dxa"/>
+              <w:end w:w="55" w:type="dxa"/>
+            </w:tcMar>
           </w:tcPr>
           <w:p>
             <w:r>
@@ -1407,9 +1992,18 @@
         </w:tc>
       </w:tr>
       <w:tr>
+        <w:trPr>
+          <w:cantSplit/>
+        </w:trPr>
         <w:tc>
           <w:tcPr>
             <w:tcW w:w="5220" w:type="dxa"/>
+            <w:tcMar>
+              <w:top w:w="55" w:type="dxa"/>
+              <w:start w:w="55" w:type="dxa"/>
+              <w:bottom w:w="55" w:type="dxa"/>
+              <w:end w:w="55" w:type="dxa"/>
+            </w:tcMar>
           </w:tcPr>
           <w:p>
             <w:r>
@@ -1420,6 +2014,12 @@
         <w:tc>
           <w:tcPr>
             <w:tcW w:w="5220" w:type="dxa"/>
+            <w:tcMar>
+              <w:top w:w="55" w:type="dxa"/>
+              <w:start w:w="55" w:type="dxa"/>
+              <w:bottom w:w="55" w:type="dxa"/>
+              <w:end w:w="55" w:type="dxa"/>
+            </w:tcMar>
           </w:tcPr>
           <w:p>
             <w:r>
@@ -1429,9 +2029,18 @@
         </w:tc>
       </w:tr>
       <w:tr>
+        <w:trPr>
+          <w:cantSplit/>
+        </w:trPr>
         <w:tc>
           <w:tcPr>
             <w:tcW w:w="5220" w:type="dxa"/>
+            <w:tcMar>
+              <w:top w:w="55" w:type="dxa"/>
+              <w:start w:w="55" w:type="dxa"/>
+              <w:bottom w:w="55" w:type="dxa"/>
+              <w:end w:w="55" w:type="dxa"/>
+            </w:tcMar>
           </w:tcPr>
           <w:p>
             <w:r>
@@ -1442,6 +2051,12 @@
         <w:tc>
           <w:tcPr>
             <w:tcW w:w="5220" w:type="dxa"/>
+            <w:tcMar>
+              <w:top w:w="55" w:type="dxa"/>
+              <w:start w:w="55" w:type="dxa"/>
+              <w:bottom w:w="55" w:type="dxa"/>
+              <w:end w:w="55" w:type="dxa"/>
+            </w:tcMar>
           </w:tcPr>
           <w:p>
             <w:r>
@@ -1451,9 +2066,18 @@
         </w:tc>
       </w:tr>
       <w:tr>
+        <w:trPr>
+          <w:cantSplit/>
+        </w:trPr>
         <w:tc>
           <w:tcPr>
             <w:tcW w:w="5220" w:type="dxa"/>
+            <w:tcMar>
+              <w:top w:w="55" w:type="dxa"/>
+              <w:start w:w="55" w:type="dxa"/>
+              <w:bottom w:w="55" w:type="dxa"/>
+              <w:end w:w="55" w:type="dxa"/>
+            </w:tcMar>
           </w:tcPr>
           <w:p>
             <w:r>
@@ -1464,6 +2088,12 @@
         <w:tc>
           <w:tcPr>
             <w:tcW w:w="5220" w:type="dxa"/>
+            <w:tcMar>
+              <w:top w:w="55" w:type="dxa"/>
+              <w:start w:w="55" w:type="dxa"/>
+              <w:bottom w:w="55" w:type="dxa"/>
+              <w:end w:w="55" w:type="dxa"/>
+            </w:tcMar>
           </w:tcPr>
           <w:p>
             <w:r>
@@ -1490,20 +2120,20 @@
     <w:p>
       <w:pPr/>
       <w:r>
-        <w:t xml:space="preserve">The comparison chart shows the recorded scalar metrics without suggesting equivalent test protocols. The confusion matrices show each model's actual test scope.</w:t>
+        <w:t xml:space="preserve">Charts report score values as percentages. Precision, Recall and F1 refer to the positive class True (label 1). Macro F1 averages classes 0 and 1. The comparison plot separates full-test text rows from image/fusion subsets; the fusion models use 150 aligned test examples.</w:t>
       </w:r>
     </w:p>
     <w:p>
       <w:r>
         <w:drawing>
           <wp:inline distT="0" distB="0" distL="0" distR="0">
-            <wp:extent cx="6000000" cy="2861538"/>
-            <wp:docPr id="2" name="Recorded test metric comparison"/>
+            <wp:extent cx="6000000" cy="3001194"/>
+            <wp:docPr id="2" name="Test metric comparison: full test rows and aligned image subset"/>
             <a:graphic>
               <a:graphicData uri="http://schemas.openxmlformats.org/drawingml/2006/picture">
                 <pic:pic>
                   <pic:nvPicPr>
-                    <pic:cNvPr id="0" name="Recorded test metric comparison"/>
+                    <pic:cNvPr id="0" name="Test metric comparison: full test rows and aligned image subset"/>
                     <pic:cNvPicPr/>
                   </pic:nvPicPr>
                   <pic:blipFill>
@@ -1515,7 +2145,7 @@
                   <pic:spPr>
                     <a:xfrm>
                       <a:off x="0" y="0"/>
-                      <a:ext cx="6000000" cy="2861538"/>
+                      <a:ext cx="6000000" cy="3001194"/>
                     </a:xfrm>
                     <a:prstGeom prst="rect">
                       <a:avLst/>
@@ -1532,13 +2162,13 @@
       <w:r>
         <w:drawing>
           <wp:inline distT="0" distB="0" distL="0" distR="0">
-            <wp:extent cx="6000000" cy="1566666"/>
-            <wp:docPr id="3" name="Recorded test confusion matrices"/>
+            <wp:extent cx="6000000" cy="2978102"/>
+            <wp:docPr id="3" name="Full official test-split confusion matrices for text models"/>
             <a:graphic>
               <a:graphicData uri="http://schemas.openxmlformats.org/drawingml/2006/picture">
                 <pic:pic>
                   <pic:nvPicPr>
-                    <pic:cNvPr id="0" name="Recorded test confusion matrices"/>
+                    <pic:cNvPr id="0" name="Full official test-split confusion matrices for text models"/>
                     <pic:cNvPicPr/>
                   </pic:nvPicPr>
                   <pic:blipFill>
@@ -1550,7 +2180,42 @@
                   <pic:spPr>
                     <a:xfrm>
                       <a:off x="0" y="0"/>
-                      <a:ext cx="6000000" cy="1566666"/>
+                      <a:ext cx="6000000" cy="2978102"/>
+                    </a:xfrm>
+                    <a:prstGeom prst="rect">
+                      <a:avLst/>
+                    </a:prstGeom>
+                  </pic:spPr>
+                </pic:pic>
+              </a:graphicData>
+            </a:graphic>
+          </wp:inline>
+        </w:drawing>
+      </w:r>
+    </w:p>
+    <w:p>
+      <w:r>
+        <w:drawing>
+          <wp:inline distT="0" distB="0" distL="0" distR="0">
+            <wp:extent cx="6000000" cy="2625149"/>
+            <wp:docPr id="4" name="Confusion matrices for image and fusion models evaluated on 150 aligned test examples"/>
+            <a:graphic>
+              <a:graphicData uri="http://schemas.openxmlformats.org/drawingml/2006/picture">
+                <pic:pic>
+                  <pic:nvPicPr>
+                    <pic:cNvPr id="0" name="Confusion matrices for image and fusion models evaluated on 150 aligned test examples"/>
+                    <pic:cNvPicPr/>
+                  </pic:nvPicPr>
+                  <pic:blipFill>
+                    <a:blip r:embed="rId4"/>
+                    <a:stretch>
+                      <a:fillRect/>
+                    </a:stretch>
+                  </pic:blipFill>
+                  <pic:spPr>
+                    <a:xfrm>
+                      <a:off x="0" y="0"/>
+                      <a:ext cx="6000000" cy="2625149"/>
                     </a:xfrm>
                     <a:prstGeom prst="rect">
                       <a:avLst/>

</xml_diff>

<commit_message>
Add Streamlit inference application and report
Connect saved text and image models to a local analysis UI, add focused tests, and update reproducibility documentation.

Co-authored-by: Copilot <223556219+Copilot@users.noreply.github.com>
</commit_message>
<xml_diff>
--- a/docs/Project_Report.docx
+++ b/docs/Project_Report.docx
@@ -39,7 +39,7 @@
         <w:t xml:space="preserve">Submission scope:</w:t>
       </w:r>
       <w:r>
-        <w:t xml:space="preserve"> ML experiments, reproducible inference and evaluation documentation. A frontend is not required.</w:t>
+        <w:t xml:space="preserve"> ML experiments, reproducible inference, evaluation documentation, and a local Streamlit application. Team and institute names are not stated because verified details were not present in the workspace.</w:t>
       </w:r>
     </w:p>
     <w:p>
@@ -53,7 +53,7 @@
     <w:p>
       <w:pPr/>
       <w:r>
-        <w:t xml:space="preserve">This project investigates misinformation classification on Fakeddit using text and image modalities. The verified implementation contains a TF-IDF plus Logistic Regression text baseline, a fine-tuned DistilBERT text classifier, and a ResNet-50 image classifier. Saved result files report full official test-split evaluation for the two text systems and held-out subset evaluation for the image model. Existing artifacts and scripts are inspected; TF-IDF and DistilBERT were additionally smoke-tested for local inference. The current models remain independent classifiers. This report does not claim that context-aware multimodal fusion or CLIP has been completed. Results, sample scopes, class imbalance, and limits to comparability are made explicit.</w:t>
+        <w:t xml:space="preserve">This project investigates misinformation classification on Fakeddit using text and image modalities. The verified implementation contains a TF-IDF plus Logistic Regression text baseline, a fine-tuned DistilBERT text classifier, and a ResNet-50 image classifier. Saved result files report full official test-split evaluation for the two text systems and held-out subset evaluation for the image model. A local Streamlit application provides inference with these saved models and displays saved metrics; it does not create new evaluation results. A separate exploratory late-fusion baseline was evaluated on 150 aligned validation and 150 aligned held-out test examples. CLIP consistency and context-metadata modeling remain incomplete. Results, sample scopes, class imbalance, and limits to comparability are made explicit.</w:t>
       </w:r>
     </w:p>
     <w:p>
@@ -85,7 +85,7 @@
     <w:p>
       <w:pPr/>
       <w:r>
-        <w:t xml:space="preserve">The submission focuses on a small, reproducible ML deliverable rather than a user interface. A context-aware fused verifier would additionally require an implemented, leakage-controlled combination of aligned modalities and any context fields. Existing standalone results do not establish that such a system has been completed.</w:t>
+        <w:t xml:space="preserve">The submission includes a Streamlit research demonstration connected to the saved classifiers. A fully context-aware verifier would additionally require a validated context model and broader leakage-controlled multimodal evaluation. The small aligned-subset fusion experiment is exploratory and does not establish that the complete context-aware system has been finished.</w:t>
       </w:r>
     </w:p>
     <w:p>
@@ -2239,7 +2239,13 @@
     <w:p>
       <w:pPr/>
       <w:r>
-        <w:t xml:space="preserve">The local inference CLI loads available model artifacts and returns individual branch predictions. Optional image inference requires a readable local image and available ResNet checkpoint. Predictions on demonstration inputs are not measured evaluation metrics. For repeatability, use the CLI command from the repository README and record the exact input/artifact version when presenting a demo.</w:t>
+        <w:t xml:space="preserve">The local Streamlit application (</w:t>
+      </w:r>
+      <w:r>
+        <w:t xml:space="preserve">python -m streamlit run app.py</w:t>
+      </w:r>
+      <w:r>
+        <w:t xml:space="preserve">) and inference CLI load available model artifacts and return individual branch predictions. Text inputs use TF-IDF and DistilBERT; optional local images use ResNet-50. When both branches succeed, the UI can additionally display the saved validation-selected late-fusion rule. This demonstration does not compute CLIP consistency or use domain/subreddit context. Predictions on demonstration inputs are not measured evaluation metrics. For repeatability, use the documented app or CLI command and record the exact input/artifact version when presenting a demo.</w:t>
       </w:r>
     </w:p>
     <w:p>
@@ -2351,7 +2357,7 @@
     <w:p>
       <w:pPr/>
       <w:r>
-        <w:t xml:space="preserve">7. No frontend, backend, deployment, or end-to-end verification service is implemented or required by the project's stated submission scope.</w:t>
+        <w:t xml:space="preserve">7. The Streamlit app is a local presentation/inference interface, not a deployed backend or an end-to-end factual verification service.</w:t>
       </w:r>
     </w:p>
     <w:p>

</xml_diff>